<commit_message>
new master file added and text file updated
</commit_message>
<xml_diff>
--- a/Weather Data Analysis Project.docx
+++ b/Weather Data Analysis Project.docx
@@ -1,14 +1,17 @@
 
 <file path=word/document.xml><?xml version="1.0" encoding="utf-8"?>
-<w:document xmlns:wpc="http://schemas.microsoft.com/office/word/2010/wordprocessingCanvas" xmlns:cx="http://schemas.microsoft.com/office/drawing/2014/chartex" xmlns:cx1="http://schemas.microsoft.com/office/drawing/2015/9/8/chartex" xmlns:cx2="http://schemas.microsoft.com/office/drawing/2015/10/21/chartex" xmlns:cx3="http://schemas.microsoft.com/office/drawing/2016/5/9/chartex" xmlns:cx4="http://schemas.microsoft.com/office/drawing/2016/5/10/chartex" xmlns:cx5="http://schemas.microsoft.com/office/drawing/2016/5/11/chartex" xmlns:cx6="http://schemas.microsoft.com/office/drawing/2016/5/12/chartex" xmlns:cx7="http://schemas.microsoft.com/office/drawing/2016/5/13/chartex" xmlns:cx8="http://schemas.microsoft.com/office/drawing/2016/5/14/chartex" xmlns:mc="http://schemas.openxmlformats.org/markup-compatibility/2006" xmlns:aink="http://schemas.microsoft.com/office/drawing/2016/ink" xmlns:am3d="http://schemas.microsoft.com/office/drawing/2017/model3d" xmlns:o="urn:schemas-microsoft-com:office:office" xmlns:oel="http://schemas.microsoft.com/office/2019/extlst" xmlns:r="http://schemas.openxmlformats.org/officeDocument/2006/relationships" xmlns:m="http://schemas.openxmlformats.org/officeDocument/2006/math" xmlns:v="urn:schemas-microsoft-com:vml" xmlns:wp14="http://schemas.microsoft.com/office/word/2010/wordprocessingDrawing" xmlns:wp="http://schemas.openxmlformats.org/drawingml/2006/wordprocessingDrawing" xmlns:w10="urn:schemas-microsoft-com:office:word" xmlns:w="http://schemas.openxmlformats.org/wordprocessingml/2006/main" xmlns:w14="http://schemas.microsoft.com/office/word/2010/wordml" xmlns:w15="http://schemas.microsoft.com/office/word/2012/wordml" xmlns:w16cex="http://schemas.microsoft.com/office/word/2018/wordml/cex" xmlns:w16cid="http://schemas.microsoft.com/office/word/2016/wordml/cid" xmlns:w16="http://schemas.microsoft.com/office/word/2018/wordml" xmlns:w16du="http://schemas.microsoft.com/office/word/2023/wordml/word16du" xmlns:w16sdtdh="http://schemas.microsoft.com/office/word/2020/wordml/sdtdatahash" xmlns:w16sdtfl="http://schemas.microsoft.com/office/word/2024/wordml/sdtformatlock" xmlns:w16se="http://schemas.microsoft.com/office/word/2015/wordml/symex" xmlns:wpg="http://schemas.microsoft.com/office/word/2010/wordprocessingGroup" xmlns:wpi="http://schemas.microsoft.com/office/word/2010/wordprocessingInk" xmlns:wne="http://schemas.microsoft.com/office/word/2006/wordml" xmlns:wps="http://schemas.microsoft.com/office/word/2010/wordprocessingShape" mc:Ignorable="w14 w15 w16se w16cid w16 w16cex w16sdtdh w16sdtfl w16du wp14">
+<w:document xmlns:wpc="http://schemas.microsoft.com/office/word/2010/wordprocessingCanvas" xmlns:cx="http://schemas.microsoft.com/office/drawing/2014/chartex" xmlns:cx1="http://schemas.microsoft.com/office/drawing/2015/9/8/chartex" xmlns:cx2="http://schemas.microsoft.com/office/drawing/2015/10/21/chartex" xmlns:cx3="http://schemas.microsoft.com/office/drawing/2016/5/9/chartex" xmlns:cx4="http://schemas.microsoft.com/office/drawing/2016/5/10/chartex" xmlns:cx5="http://schemas.microsoft.com/office/drawing/2016/5/11/chartex" xmlns:cx6="http://schemas.microsoft.com/office/drawing/2016/5/12/chartex" xmlns:cx7="http://schemas.microsoft.com/office/drawing/2016/5/13/chartex" xmlns:cx8="http://schemas.microsoft.com/office/drawing/2016/5/14/chartex" xmlns:mc="http://schemas.openxmlformats.org/markup-compatibility/2006" xmlns:aink="http://schemas.microsoft.com/office/drawing/2016/ink" xmlns:am3d="http://schemas.microsoft.com/office/drawing/2017/model3d" xmlns:o="urn:schemas-microsoft-com:office:office" xmlns:r="http://schemas.openxmlformats.org/officeDocument/2006/relationships" xmlns:m="http://schemas.openxmlformats.org/officeDocument/2006/math" xmlns:v="urn:schemas-microsoft-com:vml" xmlns:wp14="http://schemas.microsoft.com/office/word/2010/wordprocessingDrawing" xmlns:wp="http://schemas.openxmlformats.org/drawingml/2006/wordprocessingDrawing" xmlns:w10="urn:schemas-microsoft-com:office:word" xmlns:w="http://schemas.openxmlformats.org/wordprocessingml/2006/main" xmlns:w14="http://schemas.microsoft.com/office/word/2010/wordml" xmlns:w15="http://schemas.microsoft.com/office/word/2012/wordml" xmlns:w16cid="http://schemas.microsoft.com/office/word/2016/wordml/cid" xmlns:w16se="http://schemas.microsoft.com/office/word/2015/wordml/symex" xmlns:wpg="http://schemas.microsoft.com/office/word/2010/wordprocessingGroup" xmlns:wpi="http://schemas.microsoft.com/office/word/2010/wordprocessingInk" xmlns:wne="http://schemas.microsoft.com/office/word/2006/wordml" xmlns:wps="http://schemas.microsoft.com/office/word/2010/wordprocessingShape" mc:Ignorable="w14 w15 w16se w16cid wp14">
   <w:body>
     <w:p>
       <w:pPr>
-        <w:rPr>
-          <w:b/>
-          <w:bCs/>
-        </w:rPr>
-      </w:pPr>
+        <w:ind w:firstLine="720"/>
+        <w:rPr>
+          <w:b/>
+          <w:bCs/>
+        </w:rPr>
+      </w:pPr>
+      <w:bookmarkStart w:id="0" w:name="_GoBack"/>
+      <w:bookmarkEnd w:id="0"/>
       <w:r>
         <w:rPr>
           <w:b/>
@@ -44,7 +47,7 @@
     <w:p>
       <w:r>
         <w:pict w14:anchorId="6C135607">
-          <v:rect id="_x0000_i1115" style="width:0;height:1.5pt" o:hralign="center" o:hrstd="t" o:hr="t" fillcolor="#a0a0a0" stroked="f"/>
+          <v:rect id="_x0000_i1025" style="width:0;height:1.5pt" o:hralign="center" o:hrstd="t" o:hr="t" fillcolor="#a0a0a0" stroked="f"/>
         </w:pict>
       </w:r>
     </w:p>
@@ -165,7 +168,7 @@
     <w:p>
       <w:r>
         <w:pict w14:anchorId="3CD83132">
-          <v:rect id="_x0000_i1116" style="width:0;height:1.5pt" o:hralign="center" o:hrstd="t" o:hr="t" fillcolor="#a0a0a0" stroked="f"/>
+          <v:rect id="_x0000_i1026" style="width:0;height:1.5pt" o:hralign="center" o:hrstd="t" o:hr="t" fillcolor="#a0a0a0" stroked="f"/>
         </w:pict>
       </w:r>
     </w:p>
@@ -270,7 +273,7 @@
     <w:p>
       <w:r>
         <w:pict w14:anchorId="4CE41F4F">
-          <v:rect id="_x0000_i1117" style="width:0;height:1.5pt" o:hralign="center" o:hrstd="t" o:hr="t" fillcolor="#a0a0a0" stroked="f"/>
+          <v:rect id="_x0000_i1027" style="width:0;height:1.5pt" o:hralign="center" o:hrstd="t" o:hr="t" fillcolor="#a0a0a0" stroked="f"/>
         </w:pict>
       </w:r>
     </w:p>
@@ -361,7 +364,7 @@
     <w:p>
       <w:r>
         <w:pict w14:anchorId="6691F2DD">
-          <v:rect id="_x0000_i1118" style="width:0;height:1.5pt" o:hralign="center" o:hrstd="t" o:hr="t" fillcolor="#a0a0a0" stroked="f"/>
+          <v:rect id="_x0000_i1028" style="width:0;height:1.5pt" o:hralign="center" o:hrstd="t" o:hr="t" fillcolor="#a0a0a0" stroked="f"/>
         </w:pict>
       </w:r>
     </w:p>
@@ -441,7 +444,7 @@
     <w:p>
       <w:r>
         <w:pict w14:anchorId="081EE7F9">
-          <v:rect id="_x0000_i1119" style="width:0;height:1.5pt" o:hralign="center" o:hrstd="t" o:hr="t" fillcolor="#a0a0a0" stroked="f"/>
+          <v:rect id="_x0000_i1029" style="width:0;height:1.5pt" o:hralign="center" o:hrstd="t" o:hr="t" fillcolor="#a0a0a0" stroked="f"/>
         </w:pict>
       </w:r>
     </w:p>
@@ -513,16 +516,14 @@
           <w:numId w:val="5"/>
         </w:numPr>
       </w:pPr>
-      <w:proofErr w:type="gramStart"/>
       <w:r>
         <w:t>Seasonal tourism suitability</w:t>
       </w:r>
-      <w:proofErr w:type="gramEnd"/>
     </w:p>
     <w:p>
       <w:r>
         <w:pict w14:anchorId="24B5ED36">
-          <v:rect id="_x0000_i1120" style="width:0;height:1.5pt" o:hralign="center" o:hrstd="t" o:hr="t" fillcolor="#a0a0a0" stroked="f"/>
+          <v:rect id="_x0000_i1030" style="width:0;height:1.5pt" o:hralign="center" o:hrstd="t" o:hr="t" fillcolor="#a0a0a0" stroked="f"/>
         </w:pict>
       </w:r>
     </w:p>
@@ -544,7 +545,7 @@
     <w:p>
       <w:r>
         <w:pict w14:anchorId="7259FB78">
-          <v:rect id="_x0000_i1121" style="width:0;height:1.5pt" o:hralign="center" o:hrstd="t" o:hr="t" fillcolor="#a0a0a0" stroked="f"/>
+          <v:rect id="_x0000_i1031" style="width:0;height:1.5pt" o:hralign="center" o:hrstd="t" o:hr="t" fillcolor="#a0a0a0" stroked="f"/>
         </w:pict>
       </w:r>
     </w:p>
@@ -765,7 +766,7 @@
     <w:p>
       <w:r>
         <w:pict w14:anchorId="0111160C">
-          <v:rect id="_x0000_i1122" style="width:0;height:1.5pt" o:hralign="center" o:hrstd="t" o:hr="t" fillcolor="#a0a0a0" stroked="f"/>
+          <v:rect id="_x0000_i1032" style="width:0;height:1.5pt" o:hralign="center" o:hrstd="t" o:hr="t" fillcolor="#a0a0a0" stroked="f"/>
         </w:pict>
       </w:r>
     </w:p>
@@ -962,7 +963,7 @@
     <w:p>
       <w:r>
         <w:pict w14:anchorId="078769C2">
-          <v:rect id="_x0000_i1123" style="width:0;height:1.5pt" o:hralign="center" o:hrstd="t" o:hr="t" fillcolor="#a0a0a0" stroked="f"/>
+          <v:rect id="_x0000_i1033" style="width:0;height:1.5pt" o:hralign="center" o:hrstd="t" o:hr="t" fillcolor="#a0a0a0" stroked="f"/>
         </w:pict>
       </w:r>
     </w:p>
@@ -1170,7 +1171,7 @@
     <w:p>
       <w:r>
         <w:pict w14:anchorId="70F0EF12">
-          <v:rect id="_x0000_i1124" style="width:0;height:1.5pt" o:hralign="center" o:hrstd="t" o:hr="t" fillcolor="#a0a0a0" stroked="f"/>
+          <v:rect id="_x0000_i1034" style="width:0;height:1.5pt" o:hralign="center" o:hrstd="t" o:hr="t" fillcolor="#a0a0a0" stroked="f"/>
         </w:pict>
       </w:r>
     </w:p>
@@ -1255,21 +1256,12 @@
       <w:r>
         <w:t xml:space="preserve">Which </w:t>
       </w:r>
-      <w:proofErr w:type="gramStart"/>
-      <w:r>
-        <w:rPr>
-          <w:b/>
-          <w:bCs/>
-        </w:rPr>
-        <w:t>states have</w:t>
-      </w:r>
-      <w:proofErr w:type="gramEnd"/>
-      <w:r>
-        <w:rPr>
-          <w:b/>
-          <w:bCs/>
-        </w:rPr>
-        <w:t xml:space="preserve"> the highest rainfall levels</w:t>
+      <w:r>
+        <w:rPr>
+          <w:b/>
+          <w:bCs/>
+        </w:rPr>
+        <w:t>states have the highest rainfall levels</w:t>
       </w:r>
       <w:r>
         <w:t>?</w:t>
@@ -1326,7 +1318,7 @@
     <w:p>
       <w:r>
         <w:pict w14:anchorId="661088B3">
-          <v:rect id="_x0000_i1125" style="width:0;height:1.5pt" o:hralign="center" o:hrstd="t" o:hr="t" fillcolor="#a0a0a0" stroked="f"/>
+          <v:rect id="_x0000_i1035" style="width:0;height:1.5pt" o:hralign="center" o:hrstd="t" o:hr="t" fillcolor="#a0a0a0" stroked="f"/>
         </w:pict>
       </w:r>
     </w:p>
@@ -1467,15 +1459,7 @@
         </w:numPr>
       </w:pPr>
       <w:r>
-        <w:t xml:space="preserve">Wind </w:t>
-      </w:r>
-      <w:proofErr w:type="gramStart"/>
-      <w:r>
-        <w:t>speed</w:t>
-      </w:r>
-      <w:proofErr w:type="gramEnd"/>
-      <w:r>
-        <w:t xml:space="preserve"> by city</w:t>
+        <w:t>Wind speed by city</w:t>
       </w:r>
     </w:p>
     <w:p>
@@ -1486,26 +1470,13 @@
         </w:numPr>
       </w:pPr>
       <w:r>
-        <w:t xml:space="preserve">Wind </w:t>
-      </w:r>
-      <w:proofErr w:type="gramStart"/>
-      <w:r>
-        <w:t>speed</w:t>
-      </w:r>
-      <w:proofErr w:type="gramEnd"/>
-      <w:r>
-        <w:t xml:space="preserve"> by weather </w:t>
-      </w:r>
-      <w:proofErr w:type="gramStart"/>
-      <w:r>
-        <w:t>condition</w:t>
-      </w:r>
-      <w:proofErr w:type="gramEnd"/>
+        <w:t>Wind speed by weather condition</w:t>
+      </w:r>
     </w:p>
     <w:p>
       <w:r>
         <w:pict w14:anchorId="235926B4">
-          <v:rect id="_x0000_i1126" style="width:0;height:1.5pt" o:hralign="center" o:hrstd="t" o:hr="t" fillcolor="#a0a0a0" stroked="f"/>
+          <v:rect id="_x0000_i1036" style="width:0;height:1.5pt" o:hralign="center" o:hrstd="t" o:hr="t" fillcolor="#a0a0a0" stroked="f"/>
         </w:pict>
       </w:r>
     </w:p>
@@ -1577,15 +1548,7 @@
         </w:numPr>
       </w:pPr>
       <w:r>
-        <w:t xml:space="preserve">How many </w:t>
-      </w:r>
-      <w:proofErr w:type="gramStart"/>
-      <w:r>
-        <w:t>days</w:t>
-      </w:r>
-      <w:proofErr w:type="gramEnd"/>
-      <w:r>
-        <w:t xml:space="preserve"> recorded </w:t>
+        <w:t xml:space="preserve">How many days recorded </w:t>
       </w:r>
       <w:r>
         <w:rPr>
@@ -1606,15 +1569,7 @@
         </w:numPr>
       </w:pPr>
       <w:r>
-        <w:t xml:space="preserve">How many days </w:t>
-      </w:r>
-      <w:proofErr w:type="gramStart"/>
-      <w:r>
-        <w:t>recorded</w:t>
-      </w:r>
-      <w:proofErr w:type="gramEnd"/>
-      <w:r>
-        <w:t xml:space="preserve"> </w:t>
+        <w:t xml:space="preserve">How many days recorded </w:t>
       </w:r>
       <w:r>
         <w:rPr>
@@ -1687,7 +1642,7 @@
     <w:p>
       <w:r>
         <w:pict w14:anchorId="2E2E7B8B">
-          <v:rect id="_x0000_i1127" style="width:0;height:1.5pt" o:hralign="center" o:hrstd="t" o:hr="t" fillcolor="#a0a0a0" stroked="f"/>
+          <v:rect id="_x0000_i1037" style="width:0;height:1.5pt" o:hralign="center" o:hrstd="t" o:hr="t" fillcolor="#a0a0a0" stroked="f"/>
         </w:pict>
       </w:r>
     </w:p>
@@ -1820,15 +1775,7 @@
         </w:numPr>
       </w:pPr>
       <w:r>
-        <w:t xml:space="preserve">Which weather </w:t>
-      </w:r>
-      <w:proofErr w:type="gramStart"/>
-      <w:r>
-        <w:t>condition occurs</w:t>
-      </w:r>
-      <w:proofErr w:type="gramEnd"/>
-      <w:r>
-        <w:t xml:space="preserve"> most frequently?</w:t>
+        <w:t>Which weather condition occurs most frequently?</w:t>
       </w:r>
     </w:p>
     <w:p>
@@ -1861,7 +1808,7 @@
     <w:p>
       <w:r>
         <w:pict w14:anchorId="48464728">
-          <v:rect id="_x0000_i1128" style="width:0;height:1.5pt" o:hralign="center" o:hrstd="t" o:hr="t" fillcolor="#a0a0a0" stroked="f"/>
+          <v:rect id="_x0000_i1038" style="width:0;height:1.5pt" o:hralign="center" o:hrstd="t" o:hr="t" fillcolor="#a0a0a0" stroked="f"/>
         </w:pict>
       </w:r>
     </w:p>
@@ -1884,7 +1831,6 @@
       <w:r>
         <w:t xml:space="preserve">Your </w:t>
       </w:r>
-      <w:proofErr w:type="gramStart"/>
       <w:r>
         <w:rPr>
           <w:b/>
@@ -1892,7 +1838,6 @@
         </w:rPr>
         <w:t>dashboard sheet</w:t>
       </w:r>
-      <w:proofErr w:type="gramEnd"/>
       <w:r>
         <w:t xml:space="preserve"> should look like this.</w:t>
       </w:r>
@@ -1900,7 +1845,7 @@
     <w:p>
       <w:r>
         <w:pict w14:anchorId="4B24A432">
-          <v:rect id="_x0000_i1129" style="width:0;height:1.5pt" o:hralign="center" o:hrstd="t" o:hr="t" fillcolor="#a0a0a0" stroked="f"/>
+          <v:rect id="_x0000_i1039" style="width:0;height:1.5pt" o:hralign="center" o:hrstd="t" o:hr="t" fillcolor="#a0a0a0" stroked="f"/>
         </w:pict>
       </w:r>
     </w:p>
@@ -1937,8 +1882,8 @@
         <w:tblLook w:val="04A0" w:firstRow="1" w:lastRow="0" w:firstColumn="1" w:lastColumn="0" w:noHBand="0" w:noVBand="1"/>
       </w:tblPr>
       <w:tblGrid>
-        <w:gridCol w:w="1788"/>
-        <w:gridCol w:w="2220"/>
+        <w:gridCol w:w="1732"/>
+        <w:gridCol w:w="2146"/>
       </w:tblGrid>
       <w:tr>
         <w:trPr>
@@ -2201,7 +2146,7 @@
 </file>
 
 <file path=word/numbering.xml><?xml version="1.0" encoding="utf-8"?>
-<w:numbering xmlns:wpc="http://schemas.microsoft.com/office/word/2010/wordprocessingCanvas" xmlns:cx="http://schemas.microsoft.com/office/drawing/2014/chartex" xmlns:cx1="http://schemas.microsoft.com/office/drawing/2015/9/8/chartex" xmlns:cx2="http://schemas.microsoft.com/office/drawing/2015/10/21/chartex" xmlns:cx3="http://schemas.microsoft.com/office/drawing/2016/5/9/chartex" xmlns:cx4="http://schemas.microsoft.com/office/drawing/2016/5/10/chartex" xmlns:cx5="http://schemas.microsoft.com/office/drawing/2016/5/11/chartex" xmlns:cx6="http://schemas.microsoft.com/office/drawing/2016/5/12/chartex" xmlns:cx7="http://schemas.microsoft.com/office/drawing/2016/5/13/chartex" xmlns:cx8="http://schemas.microsoft.com/office/drawing/2016/5/14/chartex" xmlns:mc="http://schemas.openxmlformats.org/markup-compatibility/2006" xmlns:aink="http://schemas.microsoft.com/office/drawing/2016/ink" xmlns:am3d="http://schemas.microsoft.com/office/drawing/2017/model3d" xmlns:o="urn:schemas-microsoft-com:office:office" xmlns:oel="http://schemas.microsoft.com/office/2019/extlst" xmlns:r="http://schemas.openxmlformats.org/officeDocument/2006/relationships" xmlns:m="http://schemas.openxmlformats.org/officeDocument/2006/math" xmlns:v="urn:schemas-microsoft-com:vml" xmlns:wp14="http://schemas.microsoft.com/office/word/2010/wordprocessingDrawing" xmlns:wp="http://schemas.openxmlformats.org/drawingml/2006/wordprocessingDrawing" xmlns:w10="urn:schemas-microsoft-com:office:word" xmlns:w="http://schemas.openxmlformats.org/wordprocessingml/2006/main" xmlns:w14="http://schemas.microsoft.com/office/word/2010/wordml" xmlns:w15="http://schemas.microsoft.com/office/word/2012/wordml" xmlns:w16cex="http://schemas.microsoft.com/office/word/2018/wordml/cex" xmlns:w16cid="http://schemas.microsoft.com/office/word/2016/wordml/cid" xmlns:w16="http://schemas.microsoft.com/office/word/2018/wordml" xmlns:w16du="http://schemas.microsoft.com/office/word/2023/wordml/word16du" xmlns:w16sdtdh="http://schemas.microsoft.com/office/word/2020/wordml/sdtdatahash" xmlns:w16sdtfl="http://schemas.microsoft.com/office/word/2024/wordml/sdtformatlock" xmlns:w16se="http://schemas.microsoft.com/office/word/2015/wordml/symex" xmlns:wpg="http://schemas.microsoft.com/office/word/2010/wordprocessingGroup" xmlns:wpi="http://schemas.microsoft.com/office/word/2010/wordprocessingInk" xmlns:wne="http://schemas.microsoft.com/office/word/2006/wordml" xmlns:wps="http://schemas.microsoft.com/office/word/2010/wordprocessingShape" mc:Ignorable="w14 w15 w16se w16cid w16 w16cex w16sdtdh w16sdtfl w16du wp14">
+<w:numbering xmlns:wpc="http://schemas.microsoft.com/office/word/2010/wordprocessingCanvas" xmlns:cx="http://schemas.microsoft.com/office/drawing/2014/chartex" xmlns:cx1="http://schemas.microsoft.com/office/drawing/2015/9/8/chartex" xmlns:cx2="http://schemas.microsoft.com/office/drawing/2015/10/21/chartex" xmlns:cx3="http://schemas.microsoft.com/office/drawing/2016/5/9/chartex" xmlns:cx4="http://schemas.microsoft.com/office/drawing/2016/5/10/chartex" xmlns:cx5="http://schemas.microsoft.com/office/drawing/2016/5/11/chartex" xmlns:cx6="http://schemas.microsoft.com/office/drawing/2016/5/12/chartex" xmlns:cx7="http://schemas.microsoft.com/office/drawing/2016/5/13/chartex" xmlns:cx8="http://schemas.microsoft.com/office/drawing/2016/5/14/chartex" xmlns:mc="http://schemas.openxmlformats.org/markup-compatibility/2006" xmlns:aink="http://schemas.microsoft.com/office/drawing/2016/ink" xmlns:am3d="http://schemas.microsoft.com/office/drawing/2017/model3d" xmlns:o="urn:schemas-microsoft-com:office:office" xmlns:r="http://schemas.openxmlformats.org/officeDocument/2006/relationships" xmlns:m="http://schemas.openxmlformats.org/officeDocument/2006/math" xmlns:v="urn:schemas-microsoft-com:vml" xmlns:wp14="http://schemas.microsoft.com/office/word/2010/wordprocessingDrawing" xmlns:wp="http://schemas.openxmlformats.org/drawingml/2006/wordprocessingDrawing" xmlns:w10="urn:schemas-microsoft-com:office:word" xmlns:w="http://schemas.openxmlformats.org/wordprocessingml/2006/main" xmlns:w14="http://schemas.microsoft.com/office/word/2010/wordml" xmlns:w15="http://schemas.microsoft.com/office/word/2012/wordml" xmlns:w16cid="http://schemas.microsoft.com/office/word/2016/wordml/cid" xmlns:w16se="http://schemas.microsoft.com/office/word/2015/wordml/symex" xmlns:wpg="http://schemas.microsoft.com/office/word/2010/wordprocessingGroup" xmlns:wpi="http://schemas.microsoft.com/office/word/2010/wordprocessingInk" xmlns:wne="http://schemas.microsoft.com/office/word/2006/wordml" xmlns:wps="http://schemas.microsoft.com/office/word/2010/wordprocessingShape" mc:Ignorable="w14 w15 w16se w16cid wp14">
   <w:abstractNum w:abstractNumId="0" w15:restartNumberingAfterBreak="0">
     <w:nsid w:val="03950C2E"/>
     <w:multiLevelType w:val="multilevel"/>
@@ -4781,68 +4726,68 @@
       </w:rPr>
     </w:lvl>
   </w:abstractNum>
-  <w:num w:numId="1" w16cid:durableId="1131630879">
+  <w:num w:numId="1">
     <w:abstractNumId w:val="5"/>
   </w:num>
-  <w:num w:numId="2" w16cid:durableId="94714759">
+  <w:num w:numId="2">
     <w:abstractNumId w:val="11"/>
   </w:num>
-  <w:num w:numId="3" w16cid:durableId="1931042620">
+  <w:num w:numId="3">
     <w:abstractNumId w:val="17"/>
   </w:num>
-  <w:num w:numId="4" w16cid:durableId="2037998995">
+  <w:num w:numId="4">
     <w:abstractNumId w:val="9"/>
   </w:num>
-  <w:num w:numId="5" w16cid:durableId="55782896">
+  <w:num w:numId="5">
     <w:abstractNumId w:val="1"/>
   </w:num>
-  <w:num w:numId="6" w16cid:durableId="33846310">
+  <w:num w:numId="6">
     <w:abstractNumId w:val="2"/>
   </w:num>
-  <w:num w:numId="7" w16cid:durableId="1023869957">
+  <w:num w:numId="7">
     <w:abstractNumId w:val="7"/>
   </w:num>
-  <w:num w:numId="8" w16cid:durableId="69743678">
+  <w:num w:numId="8">
     <w:abstractNumId w:val="12"/>
   </w:num>
-  <w:num w:numId="9" w16cid:durableId="968130442">
+  <w:num w:numId="9">
     <w:abstractNumId w:val="15"/>
   </w:num>
-  <w:num w:numId="10" w16cid:durableId="93675562">
+  <w:num w:numId="10">
     <w:abstractNumId w:val="4"/>
   </w:num>
-  <w:num w:numId="11" w16cid:durableId="1823156341">
+  <w:num w:numId="11">
     <w:abstractNumId w:val="0"/>
   </w:num>
-  <w:num w:numId="12" w16cid:durableId="1844011311">
+  <w:num w:numId="12">
     <w:abstractNumId w:val="10"/>
   </w:num>
-  <w:num w:numId="13" w16cid:durableId="857738343">
+  <w:num w:numId="13">
     <w:abstractNumId w:val="3"/>
   </w:num>
-  <w:num w:numId="14" w16cid:durableId="1271473041">
+  <w:num w:numId="14">
     <w:abstractNumId w:val="16"/>
   </w:num>
-  <w:num w:numId="15" w16cid:durableId="74743602">
+  <w:num w:numId="15">
     <w:abstractNumId w:val="6"/>
   </w:num>
-  <w:num w:numId="16" w16cid:durableId="611521755">
+  <w:num w:numId="16">
     <w:abstractNumId w:val="14"/>
   </w:num>
-  <w:num w:numId="17" w16cid:durableId="101264830">
+  <w:num w:numId="17">
     <w:abstractNumId w:val="8"/>
   </w:num>
-  <w:num w:numId="18" w16cid:durableId="715734466">
+  <w:num w:numId="18">
     <w:abstractNumId w:val="18"/>
   </w:num>
-  <w:num w:numId="19" w16cid:durableId="218178523">
+  <w:num w:numId="19">
     <w:abstractNumId w:val="13"/>
   </w:num>
 </w:numbering>
 </file>
 
 <file path=word/styles.xml><?xml version="1.0" encoding="utf-8"?>
-<w:styles xmlns:mc="http://schemas.openxmlformats.org/markup-compatibility/2006" xmlns:r="http://schemas.openxmlformats.org/officeDocument/2006/relationships" xmlns:w="http://schemas.openxmlformats.org/wordprocessingml/2006/main" xmlns:w14="http://schemas.microsoft.com/office/word/2010/wordml" xmlns:w15="http://schemas.microsoft.com/office/word/2012/wordml" xmlns:w16cex="http://schemas.microsoft.com/office/word/2018/wordml/cex" xmlns:w16cid="http://schemas.microsoft.com/office/word/2016/wordml/cid" xmlns:w16="http://schemas.microsoft.com/office/word/2018/wordml" xmlns:w16du="http://schemas.microsoft.com/office/word/2023/wordml/word16du" xmlns:w16sdtdh="http://schemas.microsoft.com/office/word/2020/wordml/sdtdatahash" xmlns:w16sdtfl="http://schemas.microsoft.com/office/word/2024/wordml/sdtformatlock" xmlns:w16se="http://schemas.microsoft.com/office/word/2015/wordml/symex" mc:Ignorable="w14 w15 w16se w16cid w16 w16cex w16sdtdh w16sdtfl w16du">
+<w:styles xmlns:mc="http://schemas.openxmlformats.org/markup-compatibility/2006" xmlns:r="http://schemas.openxmlformats.org/officeDocument/2006/relationships" xmlns:w="http://schemas.openxmlformats.org/wordprocessingml/2006/main" xmlns:w14="http://schemas.microsoft.com/office/word/2010/wordml" xmlns:w15="http://schemas.microsoft.com/office/word/2012/wordml" xmlns:w16cid="http://schemas.microsoft.com/office/word/2016/wordml/cid" xmlns:w16se="http://schemas.microsoft.com/office/word/2015/wordml/symex" mc:Ignorable="w14 w15 w16se w16cid">
   <w:docDefaults>
     <w:rPrDefault>
       <w:rPr>
@@ -4860,7 +4805,7 @@
       </w:pPr>
     </w:pPrDefault>
   </w:docDefaults>
-  <w:latentStyles w:defLockedState="0" w:defUIPriority="99" w:defSemiHidden="0" w:defUnhideWhenUsed="0" w:defQFormat="0" w:count="376">
+  <w:latentStyles w:defLockedState="0" w:defUIPriority="99" w:defSemiHidden="0" w:defUnhideWhenUsed="0" w:defQFormat="0" w:count="375">
     <w:lsdException w:name="Normal" w:uiPriority="0" w:qFormat="1"/>
     <w:lsdException w:name="heading 1" w:uiPriority="9" w:qFormat="1"/>
     <w:lsdException w:name="heading 2" w:semiHidden="1" w:uiPriority="9" w:unhideWhenUsed="1" w:qFormat="1"/>
@@ -5236,7 +5181,6 @@
     <w:lsdException w:name="Smart Hyperlink" w:semiHidden="1" w:unhideWhenUsed="1"/>
     <w:lsdException w:name="Hashtag" w:semiHidden="1" w:unhideWhenUsed="1"/>
     <w:lsdException w:name="Unresolved Mention" w:semiHidden="1" w:unhideWhenUsed="1"/>
-    <w:lsdException w:name="Smart Link" w:semiHidden="1" w:unhideWhenUsed="1"/>
   </w:latentStyles>
   <w:style w:type="paragraph" w:default="1" w:styleId="Normal">
     <w:name w:val="Normal"/>
@@ -5444,6 +5388,7 @@
   <w:style w:type="character" w:default="1" w:styleId="DefaultParagraphFont">
     <w:name w:val="Default Paragraph Font"/>
     <w:uiPriority w:val="1"/>
+    <w:semiHidden/>
     <w:unhideWhenUsed/>
   </w:style>
   <w:style w:type="table" w:default="1" w:styleId="TableNormal">

</xml_diff>